<commit_message>
instalacion del capacitor, creo
</commit_message>
<xml_diff>
--- a/ionic-agular/GUIA_IONIC_CAPACITOR_ANDROID_CAMERA.docx
+++ b/ionic-agular/GUIA_IONIC_CAPACITOR_ANDROID_CAMERA.docx
@@ -142,6 +142,7 @@
             <w:pPr>
               <w:pStyle w:val="Normal"/>
               <w:widowControl/>
+              <w:suppressAutoHyphens w:val="true"/>
               <w:spacing w:lineRule="auto" w:line="240" w:before="0" w:after="0"/>
               <w:jc w:val="start"/>
               <w:rPr>
@@ -173,6 +174,7 @@
             <w:pPr>
               <w:pStyle w:val="Normal"/>
               <w:widowControl/>
+              <w:suppressAutoHyphens w:val="true"/>
               <w:spacing w:lineRule="auto" w:line="240" w:before="0" w:after="0"/>
               <w:jc w:val="start"/>
               <w:rPr>
@@ -205,6 +207,7 @@
             <w:pPr>
               <w:pStyle w:val="Normal"/>
               <w:widowControl/>
+              <w:suppressAutoHyphens w:val="true"/>
               <w:spacing w:lineRule="auto" w:line="240" w:before="0" w:after="0"/>
               <w:jc w:val="start"/>
               <w:rPr>
@@ -234,6 +237,7 @@
             <w:pPr>
               <w:pStyle w:val="Normal"/>
               <w:widowControl/>
+              <w:suppressAutoHyphens w:val="true"/>
               <w:spacing w:lineRule="auto" w:line="240" w:before="0" w:after="0"/>
               <w:jc w:val="start"/>
               <w:rPr>
@@ -266,6 +270,7 @@
             <w:pPr>
               <w:pStyle w:val="Normal"/>
               <w:widowControl/>
+              <w:suppressAutoHyphens w:val="true"/>
               <w:spacing w:lineRule="auto" w:line="240" w:before="0" w:after="0"/>
               <w:jc w:val="start"/>
               <w:rPr>
@@ -295,6 +300,7 @@
             <w:pPr>
               <w:pStyle w:val="Normal"/>
               <w:widowControl/>
+              <w:suppressAutoHyphens w:val="true"/>
               <w:spacing w:lineRule="auto" w:line="240" w:before="0" w:after="0"/>
               <w:jc w:val="start"/>
               <w:rPr>
@@ -327,6 +333,7 @@
             <w:pPr>
               <w:pStyle w:val="Normal"/>
               <w:widowControl/>
+              <w:suppressAutoHyphens w:val="true"/>
               <w:spacing w:lineRule="auto" w:line="240" w:before="0" w:after="0"/>
               <w:jc w:val="start"/>
               <w:rPr>
@@ -356,6 +363,7 @@
             <w:pPr>
               <w:pStyle w:val="Normal"/>
               <w:widowControl/>
+              <w:suppressAutoHyphens w:val="true"/>
               <w:spacing w:lineRule="auto" w:line="240" w:before="0" w:after="0"/>
               <w:jc w:val="start"/>
               <w:rPr>
@@ -388,6 +396,7 @@
             <w:pPr>
               <w:pStyle w:val="Normal"/>
               <w:widowControl/>
+              <w:suppressAutoHyphens w:val="true"/>
               <w:spacing w:lineRule="auto" w:line="240" w:before="0" w:after="0"/>
               <w:jc w:val="start"/>
               <w:rPr>
@@ -417,6 +426,7 @@
             <w:pPr>
               <w:pStyle w:val="Normal"/>
               <w:widowControl/>
+              <w:suppressAutoHyphens w:val="true"/>
               <w:spacing w:lineRule="auto" w:line="240" w:before="0" w:after="0"/>
               <w:jc w:val="start"/>
               <w:rPr>
@@ -449,6 +459,7 @@
             <w:pPr>
               <w:pStyle w:val="Normal"/>
               <w:widowControl/>
+              <w:suppressAutoHyphens w:val="true"/>
               <w:spacing w:lineRule="auto" w:line="240" w:before="0" w:after="0"/>
               <w:jc w:val="start"/>
               <w:rPr>
@@ -478,6 +489,7 @@
             <w:pPr>
               <w:pStyle w:val="Normal"/>
               <w:widowControl/>
+              <w:suppressAutoHyphens w:val="true"/>
               <w:spacing w:lineRule="auto" w:line="240" w:before="0" w:after="0"/>
               <w:jc w:val="start"/>
               <w:rPr>
@@ -510,6 +522,7 @@
             <w:pPr>
               <w:pStyle w:val="Normal"/>
               <w:widowControl/>
+              <w:suppressAutoHyphens w:val="true"/>
               <w:spacing w:lineRule="auto" w:line="240" w:before="0" w:after="0"/>
               <w:jc w:val="start"/>
               <w:rPr>
@@ -539,6 +552,7 @@
             <w:pPr>
               <w:pStyle w:val="Normal"/>
               <w:widowControl/>
+              <w:suppressAutoHyphens w:val="true"/>
               <w:spacing w:lineRule="auto" w:line="240" w:before="0" w:after="0"/>
               <w:jc w:val="start"/>
               <w:rPr>
@@ -1831,6 +1845,7 @@
             <w:pPr>
               <w:pStyle w:val="Normal"/>
               <w:widowControl/>
+              <w:suppressAutoHyphens w:val="true"/>
               <w:spacing w:lineRule="auto" w:line="240" w:before="0" w:after="0"/>
               <w:jc w:val="start"/>
               <w:rPr>
@@ -1861,6 +1876,7 @@
             <w:pPr>
               <w:pStyle w:val="Normal"/>
               <w:widowControl/>
+              <w:suppressAutoHyphens w:val="true"/>
               <w:spacing w:lineRule="auto" w:line="240" w:before="0" w:after="0"/>
               <w:jc w:val="start"/>
               <w:rPr>
@@ -1893,6 +1909,7 @@
             <w:pPr>
               <w:pStyle w:val="Normal"/>
               <w:widowControl/>
+              <w:suppressAutoHyphens w:val="true"/>
               <w:spacing w:lineRule="auto" w:line="240" w:before="0" w:after="0"/>
               <w:jc w:val="start"/>
               <w:rPr>
@@ -1922,6 +1939,7 @@
             <w:pPr>
               <w:pStyle w:val="Normal"/>
               <w:widowControl/>
+              <w:suppressAutoHyphens w:val="true"/>
               <w:spacing w:lineRule="auto" w:line="240" w:before="0" w:after="0"/>
               <w:jc w:val="start"/>
               <w:rPr>
@@ -1954,6 +1972,7 @@
             <w:pPr>
               <w:pStyle w:val="Normal"/>
               <w:widowControl/>
+              <w:suppressAutoHyphens w:val="true"/>
               <w:spacing w:lineRule="auto" w:line="240" w:before="0" w:after="0"/>
               <w:jc w:val="start"/>
               <w:rPr>
@@ -1983,6 +2002,7 @@
             <w:pPr>
               <w:pStyle w:val="Normal"/>
               <w:widowControl/>
+              <w:suppressAutoHyphens w:val="true"/>
               <w:spacing w:lineRule="auto" w:line="240" w:before="0" w:after="0"/>
               <w:jc w:val="start"/>
               <w:rPr>
@@ -2015,6 +2035,7 @@
             <w:pPr>
               <w:pStyle w:val="Normal"/>
               <w:widowControl/>
+              <w:suppressAutoHyphens w:val="true"/>
               <w:spacing w:lineRule="auto" w:line="240" w:before="0" w:after="0"/>
               <w:jc w:val="start"/>
               <w:rPr>
@@ -2044,6 +2065,7 @@
             <w:pPr>
               <w:pStyle w:val="Normal"/>
               <w:widowControl/>
+              <w:suppressAutoHyphens w:val="true"/>
               <w:spacing w:lineRule="auto" w:line="240" w:before="0" w:after="0"/>
               <w:jc w:val="start"/>
               <w:rPr>
@@ -2076,6 +2098,7 @@
             <w:pPr>
               <w:pStyle w:val="Normal"/>
               <w:widowControl/>
+              <w:suppressAutoHyphens w:val="true"/>
               <w:spacing w:lineRule="auto" w:line="240" w:before="0" w:after="0"/>
               <w:jc w:val="start"/>
               <w:rPr>
@@ -2105,6 +2128,7 @@
             <w:pPr>
               <w:pStyle w:val="Normal"/>
               <w:widowControl/>
+              <w:suppressAutoHyphens w:val="true"/>
               <w:spacing w:lineRule="auto" w:line="240" w:before="0" w:after="0"/>
               <w:jc w:val="start"/>
               <w:rPr>
@@ -2137,6 +2161,7 @@
             <w:pPr>
               <w:pStyle w:val="Normal"/>
               <w:widowControl/>
+              <w:suppressAutoHyphens w:val="true"/>
               <w:spacing w:lineRule="auto" w:line="240" w:before="0" w:after="0"/>
               <w:jc w:val="start"/>
               <w:rPr>
@@ -2166,6 +2191,7 @@
             <w:pPr>
               <w:pStyle w:val="Normal"/>
               <w:widowControl/>
+              <w:suppressAutoHyphens w:val="true"/>
               <w:spacing w:lineRule="auto" w:line="240" w:before="0" w:after="0"/>
               <w:jc w:val="start"/>
               <w:rPr>
@@ -2198,6 +2224,7 @@
             <w:pPr>
               <w:pStyle w:val="Normal"/>
               <w:widowControl/>
+              <w:suppressAutoHyphens w:val="true"/>
               <w:spacing w:lineRule="auto" w:line="240" w:before="0" w:after="0"/>
               <w:jc w:val="start"/>
               <w:rPr>
@@ -2227,6 +2254,7 @@
             <w:pPr>
               <w:pStyle w:val="Normal"/>
               <w:widowControl/>
+              <w:suppressAutoHyphens w:val="true"/>
               <w:spacing w:lineRule="auto" w:line="240" w:before="0" w:after="0"/>
               <w:jc w:val="start"/>
               <w:rPr>
@@ -2437,6 +2465,7 @@
         </w:tabs>
         <w:ind w:start="1080" w:hanging="360"/>
       </w:pPr>
+      <w:rPr/>
     </w:lvl>
     <w:lvl w:ilvl="2">
       <w:start w:val="1"/>
@@ -2449,6 +2478,7 @@
         </w:tabs>
         <w:ind w:start="1440" w:hanging="360"/>
       </w:pPr>
+      <w:rPr/>
     </w:lvl>
     <w:lvl w:ilvl="3">
       <w:start w:val="1"/>
@@ -2461,6 +2491,7 @@
         </w:tabs>
         <w:ind w:start="1800" w:hanging="360"/>
       </w:pPr>
+      <w:rPr/>
     </w:lvl>
     <w:lvl w:ilvl="4">
       <w:start w:val="1"/>
@@ -2473,6 +2504,7 @@
         </w:tabs>
         <w:ind w:start="2160" w:hanging="360"/>
       </w:pPr>
+      <w:rPr/>
     </w:lvl>
     <w:lvl w:ilvl="5">
       <w:start w:val="1"/>
@@ -2485,6 +2517,7 @@
         </w:tabs>
         <w:ind w:start="2520" w:hanging="360"/>
       </w:pPr>
+      <w:rPr/>
     </w:lvl>
     <w:lvl w:ilvl="6">
       <w:start w:val="1"/>
@@ -2497,6 +2530,7 @@
         </w:tabs>
         <w:ind w:start="2880" w:hanging="360"/>
       </w:pPr>
+      <w:rPr/>
     </w:lvl>
     <w:lvl w:ilvl="7">
       <w:start w:val="1"/>
@@ -2509,6 +2543,7 @@
         </w:tabs>
         <w:ind w:start="3240" w:hanging="360"/>
       </w:pPr>
+      <w:rPr/>
     </w:lvl>
     <w:lvl w:ilvl="8">
       <w:start w:val="1"/>
@@ -2521,6 +2556,7 @@
         </w:tabs>
         <w:ind w:start="3600" w:hanging="360"/>
       </w:pPr>
+      <w:rPr/>
     </w:lvl>
   </w:abstractNum>
   <w:abstractNum w:abstractNumId="2">
@@ -2550,6 +2586,7 @@
         </w:tabs>
         <w:ind w:start="1080" w:hanging="360"/>
       </w:pPr>
+      <w:rPr/>
     </w:lvl>
     <w:lvl w:ilvl="2">
       <w:start w:val="1"/>
@@ -2562,6 +2599,7 @@
         </w:tabs>
         <w:ind w:start="1440" w:hanging="360"/>
       </w:pPr>
+      <w:rPr/>
     </w:lvl>
     <w:lvl w:ilvl="3">
       <w:start w:val="1"/>
@@ -2574,6 +2612,7 @@
         </w:tabs>
         <w:ind w:start="1800" w:hanging="360"/>
       </w:pPr>
+      <w:rPr/>
     </w:lvl>
     <w:lvl w:ilvl="4">
       <w:start w:val="1"/>
@@ -2586,6 +2625,7 @@
         </w:tabs>
         <w:ind w:start="2160" w:hanging="360"/>
       </w:pPr>
+      <w:rPr/>
     </w:lvl>
     <w:lvl w:ilvl="5">
       <w:start w:val="1"/>
@@ -2598,6 +2638,7 @@
         </w:tabs>
         <w:ind w:start="2520" w:hanging="360"/>
       </w:pPr>
+      <w:rPr/>
     </w:lvl>
     <w:lvl w:ilvl="6">
       <w:start w:val="1"/>
@@ -2610,6 +2651,7 @@
         </w:tabs>
         <w:ind w:start="2880" w:hanging="360"/>
       </w:pPr>
+      <w:rPr/>
     </w:lvl>
     <w:lvl w:ilvl="7">
       <w:start w:val="1"/>
@@ -2622,6 +2664,7 @@
         </w:tabs>
         <w:ind w:start="3240" w:hanging="360"/>
       </w:pPr>
+      <w:rPr/>
     </w:lvl>
     <w:lvl w:ilvl="8">
       <w:start w:val="1"/>
@@ -2634,6 +2677,7 @@
         </w:tabs>
         <w:ind w:start="3600" w:hanging="360"/>
       </w:pPr>
+      <w:rPr/>
     </w:lvl>
   </w:abstractNum>
   <w:abstractNum w:abstractNumId="3">
@@ -2663,6 +2707,7 @@
         </w:tabs>
         <w:ind w:start="1080" w:hanging="360"/>
       </w:pPr>
+      <w:rPr/>
     </w:lvl>
     <w:lvl w:ilvl="2">
       <w:start w:val="1"/>
@@ -2675,6 +2720,7 @@
         </w:tabs>
         <w:ind w:start="1440" w:hanging="360"/>
       </w:pPr>
+      <w:rPr/>
     </w:lvl>
     <w:lvl w:ilvl="3">
       <w:start w:val="1"/>
@@ -2687,6 +2733,7 @@
         </w:tabs>
         <w:ind w:start="1800" w:hanging="360"/>
       </w:pPr>
+      <w:rPr/>
     </w:lvl>
     <w:lvl w:ilvl="4">
       <w:start w:val="1"/>
@@ -2699,6 +2746,7 @@
         </w:tabs>
         <w:ind w:start="2160" w:hanging="360"/>
       </w:pPr>
+      <w:rPr/>
     </w:lvl>
     <w:lvl w:ilvl="5">
       <w:start w:val="1"/>
@@ -2711,6 +2759,7 @@
         </w:tabs>
         <w:ind w:start="2520" w:hanging="360"/>
       </w:pPr>
+      <w:rPr/>
     </w:lvl>
     <w:lvl w:ilvl="6">
       <w:start w:val="1"/>
@@ -2723,6 +2772,7 @@
         </w:tabs>
         <w:ind w:start="2880" w:hanging="360"/>
       </w:pPr>
+      <w:rPr/>
     </w:lvl>
     <w:lvl w:ilvl="7">
       <w:start w:val="1"/>
@@ -2735,6 +2785,7 @@
         </w:tabs>
         <w:ind w:start="3240" w:hanging="360"/>
       </w:pPr>
+      <w:rPr/>
     </w:lvl>
     <w:lvl w:ilvl="8">
       <w:start w:val="1"/>
@@ -2747,6 +2798,7 @@
         </w:tabs>
         <w:ind w:start="3600" w:hanging="360"/>
       </w:pPr>
+      <w:rPr/>
     </w:lvl>
   </w:abstractNum>
   <w:abstractNum w:abstractNumId="4">
@@ -2774,6 +2826,7 @@
         </w:tabs>
         <w:ind w:start="1080" w:hanging="360"/>
       </w:pPr>
+      <w:rPr/>
     </w:lvl>
     <w:lvl w:ilvl="2">
       <w:start w:val="1"/>
@@ -2786,6 +2839,7 @@
         </w:tabs>
         <w:ind w:start="1440" w:hanging="360"/>
       </w:pPr>
+      <w:rPr/>
     </w:lvl>
     <w:lvl w:ilvl="3">
       <w:start w:val="1"/>
@@ -2798,6 +2852,7 @@
         </w:tabs>
         <w:ind w:start="1800" w:hanging="360"/>
       </w:pPr>
+      <w:rPr/>
     </w:lvl>
     <w:lvl w:ilvl="4">
       <w:start w:val="1"/>
@@ -2810,6 +2865,7 @@
         </w:tabs>
         <w:ind w:start="2160" w:hanging="360"/>
       </w:pPr>
+      <w:rPr/>
     </w:lvl>
     <w:lvl w:ilvl="5">
       <w:start w:val="1"/>
@@ -2822,6 +2878,7 @@
         </w:tabs>
         <w:ind w:start="2520" w:hanging="360"/>
       </w:pPr>
+      <w:rPr/>
     </w:lvl>
     <w:lvl w:ilvl="6">
       <w:start w:val="1"/>
@@ -2834,6 +2891,7 @@
         </w:tabs>
         <w:ind w:start="2880" w:hanging="360"/>
       </w:pPr>
+      <w:rPr/>
     </w:lvl>
     <w:lvl w:ilvl="7">
       <w:start w:val="1"/>
@@ -2846,6 +2904,7 @@
         </w:tabs>
         <w:ind w:start="3240" w:hanging="360"/>
       </w:pPr>
+      <w:rPr/>
     </w:lvl>
     <w:lvl w:ilvl="8">
       <w:start w:val="1"/>
@@ -2858,6 +2917,7 @@
         </w:tabs>
         <w:ind w:start="3600" w:hanging="360"/>
       </w:pPr>
+      <w:rPr/>
     </w:lvl>
   </w:abstractNum>
   <w:abstractNum w:abstractNumId="5">
@@ -2885,6 +2945,7 @@
         </w:tabs>
         <w:ind w:start="1080" w:hanging="360"/>
       </w:pPr>
+      <w:rPr/>
     </w:lvl>
     <w:lvl w:ilvl="2">
       <w:start w:val="1"/>
@@ -2897,6 +2958,7 @@
         </w:tabs>
         <w:ind w:start="1440" w:hanging="360"/>
       </w:pPr>
+      <w:rPr/>
     </w:lvl>
     <w:lvl w:ilvl="3">
       <w:start w:val="1"/>
@@ -2909,6 +2971,7 @@
         </w:tabs>
         <w:ind w:start="1800" w:hanging="360"/>
       </w:pPr>
+      <w:rPr/>
     </w:lvl>
     <w:lvl w:ilvl="4">
       <w:start w:val="1"/>
@@ -2921,6 +2984,7 @@
         </w:tabs>
         <w:ind w:start="2160" w:hanging="360"/>
       </w:pPr>
+      <w:rPr/>
     </w:lvl>
     <w:lvl w:ilvl="5">
       <w:start w:val="1"/>
@@ -2933,6 +2997,7 @@
         </w:tabs>
         <w:ind w:start="2520" w:hanging="360"/>
       </w:pPr>
+      <w:rPr/>
     </w:lvl>
     <w:lvl w:ilvl="6">
       <w:start w:val="1"/>
@@ -2945,6 +3010,7 @@
         </w:tabs>
         <w:ind w:start="2880" w:hanging="360"/>
       </w:pPr>
+      <w:rPr/>
     </w:lvl>
     <w:lvl w:ilvl="7">
       <w:start w:val="1"/>
@@ -2957,6 +3023,7 @@
         </w:tabs>
         <w:ind w:start="3240" w:hanging="360"/>
       </w:pPr>
+      <w:rPr/>
     </w:lvl>
     <w:lvl w:ilvl="8">
       <w:start w:val="1"/>
@@ -2969,6 +3036,7 @@
         </w:tabs>
         <w:ind w:start="3600" w:hanging="360"/>
       </w:pPr>
+      <w:rPr/>
     </w:lvl>
   </w:abstractNum>
   <w:abstractNum w:abstractNumId="6">
@@ -2996,6 +3064,7 @@
         </w:tabs>
         <w:ind w:start="1080" w:hanging="360"/>
       </w:pPr>
+      <w:rPr/>
     </w:lvl>
     <w:lvl w:ilvl="2">
       <w:start w:val="1"/>
@@ -3008,6 +3077,7 @@
         </w:tabs>
         <w:ind w:start="1440" w:hanging="360"/>
       </w:pPr>
+      <w:rPr/>
     </w:lvl>
     <w:lvl w:ilvl="3">
       <w:start w:val="1"/>
@@ -3020,6 +3090,7 @@
         </w:tabs>
         <w:ind w:start="1800" w:hanging="360"/>
       </w:pPr>
+      <w:rPr/>
     </w:lvl>
     <w:lvl w:ilvl="4">
       <w:start w:val="1"/>
@@ -3032,6 +3103,7 @@
         </w:tabs>
         <w:ind w:start="2160" w:hanging="360"/>
       </w:pPr>
+      <w:rPr/>
     </w:lvl>
     <w:lvl w:ilvl="5">
       <w:start w:val="1"/>
@@ -3044,6 +3116,7 @@
         </w:tabs>
         <w:ind w:start="2520" w:hanging="360"/>
       </w:pPr>
+      <w:rPr/>
     </w:lvl>
     <w:lvl w:ilvl="6">
       <w:start w:val="1"/>
@@ -3056,6 +3129,7 @@
         </w:tabs>
         <w:ind w:start="2880" w:hanging="360"/>
       </w:pPr>
+      <w:rPr/>
     </w:lvl>
     <w:lvl w:ilvl="7">
       <w:start w:val="1"/>
@@ -3068,6 +3142,7 @@
         </w:tabs>
         <w:ind w:start="3240" w:hanging="360"/>
       </w:pPr>
+      <w:rPr/>
     </w:lvl>
     <w:lvl w:ilvl="8">
       <w:start w:val="1"/>
@@ -3080,6 +3155,7 @@
         </w:tabs>
         <w:ind w:start="3600" w:hanging="360"/>
       </w:pPr>
+      <w:rPr/>
     </w:lvl>
   </w:abstractNum>
   <w:abstractNum w:abstractNumId="7">
@@ -3230,7 +3306,7 @@
   <w:docDefaults>
     <w:rPrDefault>
       <w:rPr>
-        <w:rFonts w:ascii="Cambria" w:hAnsi="Cambria" w:eastAsia="ＭＳ 明朝" w:cs="" w:asciiTheme="minorHAnsi" w:cstheme="minorBidi" w:eastAsiaTheme="minorEastAsia" w:hAnsiTheme="minorHAnsi"/>
+        <w:rFonts w:ascii="Cambria" w:hAnsi="Cambria" w:eastAsia="" w:cs="" w:asciiTheme="minorHAnsi" w:cstheme="minorBidi" w:eastAsiaTheme="minorEastAsia" w:hAnsiTheme="minorHAnsi"/>
         <w:sz w:val="22"/>
         <w:szCs w:val="22"/>
         <w:lang w:val="en-US" w:eastAsia="en-US" w:bidi="ar-SA"/>
@@ -3387,12 +3463,13 @@
     <w:rsid w:val="00fc693f"/>
     <w:pPr>
       <w:widowControl/>
+      <w:suppressAutoHyphens w:val="true"/>
       <w:bidi w:val="0"/>
       <w:spacing w:lineRule="auto" w:line="276" w:before="0" w:after="200"/>
       <w:jc w:val="start"/>
     </w:pPr>
     <w:rPr>
-      <w:rFonts w:ascii="Aptos" w:hAnsi="Aptos" w:eastAsia="ＭＳ 明朝" w:cs="" w:cstheme="minorBidi" w:eastAsiaTheme="minorEastAsia"/>
+      <w:rFonts w:ascii="Aptos" w:hAnsi="Aptos" w:eastAsia="" w:cs="" w:cstheme="minorBidi" w:eastAsiaTheme="minorEastAsia"/>
       <w:color w:val="auto"/>
       <w:kern w:val="0"/>
       <w:sz w:val="21"/>
@@ -3415,7 +3492,7 @@
       <w:outlineLvl w:val="0"/>
     </w:pPr>
     <w:rPr>
-      <w:rFonts w:ascii="Calibri" w:hAnsi="Calibri" w:eastAsia="ＭＳ ゴシック" w:cs="" w:asciiTheme="majorHAnsi" w:cstheme="majorBidi" w:eastAsiaTheme="majorEastAsia" w:hAnsiTheme="majorHAnsi"/>
+      <w:rFonts w:ascii="Calibri" w:hAnsi="Calibri" w:eastAsia="" w:cs="" w:asciiTheme="majorHAnsi" w:cstheme="majorBidi" w:eastAsiaTheme="majorEastAsia" w:hAnsiTheme="majorHAnsi"/>
       <w:b/>
       <w:bCs/>
       <w:color w:val="1F4E79"/>
@@ -3439,7 +3516,7 @@
       <w:outlineLvl w:val="1"/>
     </w:pPr>
     <w:rPr>
-      <w:rFonts w:ascii="Calibri" w:hAnsi="Calibri" w:eastAsia="ＭＳ ゴシック" w:cs="" w:asciiTheme="majorHAnsi" w:cstheme="majorBidi" w:eastAsiaTheme="majorEastAsia" w:hAnsiTheme="majorHAnsi"/>
+      <w:rFonts w:ascii="Calibri" w:hAnsi="Calibri" w:eastAsia="" w:cs="" w:asciiTheme="majorHAnsi" w:cstheme="majorBidi" w:eastAsiaTheme="majorEastAsia" w:hAnsiTheme="majorHAnsi"/>
       <w:b/>
       <w:bCs/>
       <w:color w:val="2F75B5"/>
@@ -3463,7 +3540,7 @@
       <w:outlineLvl w:val="2"/>
     </w:pPr>
     <w:rPr>
-      <w:rFonts w:ascii="Calibri" w:hAnsi="Calibri" w:eastAsia="ＭＳ ゴシック" w:cs="" w:asciiTheme="majorHAnsi" w:cstheme="majorBidi" w:eastAsiaTheme="majorEastAsia" w:hAnsiTheme="majorHAnsi"/>
+      <w:rFonts w:ascii="Calibri" w:hAnsi="Calibri" w:eastAsia="" w:cs="" w:asciiTheme="majorHAnsi" w:cstheme="majorBidi" w:eastAsiaTheme="majorEastAsia" w:hAnsiTheme="majorHAnsi"/>
       <w:b/>
       <w:bCs/>
       <w:color w:val="5B9BD5"/>
@@ -3487,7 +3564,7 @@
       <w:outlineLvl w:val="3"/>
     </w:pPr>
     <w:rPr>
-      <w:rFonts w:ascii="Calibri" w:hAnsi="Calibri" w:eastAsia="ＭＳ ゴシック" w:cs="" w:asciiTheme="majorHAnsi" w:cstheme="majorBidi" w:eastAsiaTheme="majorEastAsia" w:hAnsiTheme="majorHAnsi"/>
+      <w:rFonts w:ascii="Calibri" w:hAnsi="Calibri" w:eastAsia="" w:cs="" w:asciiTheme="majorHAnsi" w:cstheme="majorBidi" w:eastAsiaTheme="majorEastAsia" w:hAnsiTheme="majorHAnsi"/>
       <w:b/>
       <w:bCs/>
       <w:i/>
@@ -3512,7 +3589,7 @@
       <w:outlineLvl w:val="4"/>
     </w:pPr>
     <w:rPr>
-      <w:rFonts w:ascii="Calibri" w:hAnsi="Calibri" w:eastAsia="ＭＳ ゴシック" w:cs="" w:asciiTheme="majorHAnsi" w:cstheme="majorBidi" w:eastAsiaTheme="majorEastAsia" w:hAnsiTheme="majorHAnsi"/>
+      <w:rFonts w:ascii="Calibri" w:hAnsi="Calibri" w:eastAsia="" w:cs="" w:asciiTheme="majorHAnsi" w:cstheme="majorBidi" w:eastAsiaTheme="majorEastAsia" w:hAnsiTheme="majorHAnsi"/>
       <w:color w:themeColor="accent1" w:themeShade="7f" w:val="243F60"/>
     </w:rPr>
   </w:style>
@@ -3533,7 +3610,7 @@
       <w:outlineLvl w:val="5"/>
     </w:pPr>
     <w:rPr>
-      <w:rFonts w:ascii="Calibri" w:hAnsi="Calibri" w:eastAsia="ＭＳ ゴシック" w:cs="" w:asciiTheme="majorHAnsi" w:cstheme="majorBidi" w:eastAsiaTheme="majorEastAsia" w:hAnsiTheme="majorHAnsi"/>
+      <w:rFonts w:ascii="Calibri" w:hAnsi="Calibri" w:eastAsia="" w:cs="" w:asciiTheme="majorHAnsi" w:cstheme="majorBidi" w:eastAsiaTheme="majorEastAsia" w:hAnsiTheme="majorHAnsi"/>
       <w:i/>
       <w:iCs/>
       <w:color w:themeColor="accent1" w:themeShade="7f" w:val="243F60"/>
@@ -3556,7 +3633,7 @@
       <w:outlineLvl w:val="6"/>
     </w:pPr>
     <w:rPr>
-      <w:rFonts w:ascii="Calibri" w:hAnsi="Calibri" w:eastAsia="ＭＳ ゴシック" w:cs="" w:asciiTheme="majorHAnsi" w:cstheme="majorBidi" w:eastAsiaTheme="majorEastAsia" w:hAnsiTheme="majorHAnsi"/>
+      <w:rFonts w:ascii="Calibri" w:hAnsi="Calibri" w:eastAsia="" w:cs="" w:asciiTheme="majorHAnsi" w:cstheme="majorBidi" w:eastAsiaTheme="majorEastAsia" w:hAnsiTheme="majorHAnsi"/>
       <w:i/>
       <w:iCs/>
       <w:color w:themeColor="text1" w:themeTint="bf" w:val="404040"/>
@@ -3579,7 +3656,7 @@
       <w:outlineLvl w:val="7"/>
     </w:pPr>
     <w:rPr>
-      <w:rFonts w:ascii="Calibri" w:hAnsi="Calibri" w:eastAsia="ＭＳ ゴシック" w:cs="" w:asciiTheme="majorHAnsi" w:cstheme="majorBidi" w:eastAsiaTheme="majorEastAsia" w:hAnsiTheme="majorHAnsi"/>
+      <w:rFonts w:ascii="Calibri" w:hAnsi="Calibri" w:eastAsia="" w:cs="" w:asciiTheme="majorHAnsi" w:cstheme="majorBidi" w:eastAsiaTheme="majorEastAsia" w:hAnsiTheme="majorHAnsi"/>
       <w:color w:themeColor="accent1" w:val="4F81BD"/>
       <w:sz w:val="20"/>
       <w:szCs w:val="20"/>
@@ -3602,7 +3679,7 @@
       <w:outlineLvl w:val="8"/>
     </w:pPr>
     <w:rPr>
-      <w:rFonts w:ascii="Calibri" w:hAnsi="Calibri" w:eastAsia="ＭＳ ゴシック" w:cs="" w:asciiTheme="majorHAnsi" w:cstheme="majorBidi" w:eastAsiaTheme="majorEastAsia" w:hAnsiTheme="majorHAnsi"/>
+      <w:rFonts w:ascii="Calibri" w:hAnsi="Calibri" w:eastAsia="" w:cs="" w:asciiTheme="majorHAnsi" w:cstheme="majorBidi" w:eastAsiaTheme="majorEastAsia" w:hAnsiTheme="majorHAnsi"/>
       <w:i/>
       <w:iCs/>
       <w:color w:themeColor="text1" w:themeTint="bf" w:val="404040"/>
@@ -3644,7 +3721,7 @@
     <w:qFormat/>
     <w:rsid w:val="00fc693f"/>
     <w:rPr>
-      <w:rFonts w:ascii="Calibri" w:hAnsi="Calibri" w:eastAsia="ＭＳ ゴシック" w:cs="" w:asciiTheme="majorHAnsi" w:cstheme="majorBidi" w:eastAsiaTheme="majorEastAsia" w:hAnsiTheme="majorHAnsi"/>
+      <w:rFonts w:ascii="Calibri" w:hAnsi="Calibri" w:eastAsia="" w:cs="" w:asciiTheme="majorHAnsi" w:cstheme="majorBidi" w:eastAsiaTheme="majorEastAsia" w:hAnsiTheme="majorHAnsi"/>
       <w:b/>
       <w:bCs/>
       <w:color w:themeColor="accent1" w:themeShade="bf" w:val="365F91"/>
@@ -3660,7 +3737,7 @@
     <w:qFormat/>
     <w:rsid w:val="00fc693f"/>
     <w:rPr>
-      <w:rFonts w:ascii="Calibri" w:hAnsi="Calibri" w:eastAsia="ＭＳ ゴシック" w:cs="" w:asciiTheme="majorHAnsi" w:cstheme="majorBidi" w:eastAsiaTheme="majorEastAsia" w:hAnsiTheme="majorHAnsi"/>
+      <w:rFonts w:ascii="Calibri" w:hAnsi="Calibri" w:eastAsia="" w:cs="" w:asciiTheme="majorHAnsi" w:cstheme="majorBidi" w:eastAsiaTheme="majorEastAsia" w:hAnsiTheme="majorHAnsi"/>
       <w:b/>
       <w:bCs/>
       <w:color w:themeColor="accent1" w:val="4F81BD"/>
@@ -3676,7 +3753,7 @@
     <w:qFormat/>
     <w:rsid w:val="00fc693f"/>
     <w:rPr>
-      <w:rFonts w:ascii="Calibri" w:hAnsi="Calibri" w:eastAsia="ＭＳ ゴシック" w:cs="" w:asciiTheme="majorHAnsi" w:cstheme="majorBidi" w:eastAsiaTheme="majorEastAsia" w:hAnsiTheme="majorHAnsi"/>
+      <w:rFonts w:ascii="Calibri" w:hAnsi="Calibri" w:eastAsia="" w:cs="" w:asciiTheme="majorHAnsi" w:cstheme="majorBidi" w:eastAsiaTheme="majorEastAsia" w:hAnsiTheme="majorHAnsi"/>
       <w:b/>
       <w:bCs/>
       <w:color w:themeColor="accent1" w:val="4F81BD"/>
@@ -3690,7 +3767,7 @@
     <w:qFormat/>
     <w:rsid w:val="00fc693f"/>
     <w:rPr>
-      <w:rFonts w:ascii="Calibri" w:hAnsi="Calibri" w:eastAsia="ＭＳ ゴシック" w:cs="" w:asciiTheme="majorHAnsi" w:cstheme="majorBidi" w:eastAsiaTheme="majorEastAsia" w:hAnsiTheme="majorHAnsi"/>
+      <w:rFonts w:ascii="Calibri" w:hAnsi="Calibri" w:eastAsia="" w:cs="" w:asciiTheme="majorHAnsi" w:cstheme="majorBidi" w:eastAsiaTheme="majorEastAsia" w:hAnsiTheme="majorHAnsi"/>
       <w:color w:themeColor="text2" w:themeShade="bf" w:val="17365D"/>
       <w:spacing w:val="5"/>
       <w:kern w:val="2"/>
@@ -3706,7 +3783,7 @@
     <w:qFormat/>
     <w:rsid w:val="00fc693f"/>
     <w:rPr>
-      <w:rFonts w:ascii="Calibri" w:hAnsi="Calibri" w:eastAsia="ＭＳ ゴシック" w:cs="" w:asciiTheme="majorHAnsi" w:cstheme="majorBidi" w:eastAsiaTheme="majorEastAsia" w:hAnsiTheme="majorHAnsi"/>
+      <w:rFonts w:ascii="Calibri" w:hAnsi="Calibri" w:eastAsia="" w:cs="" w:asciiTheme="majorHAnsi" w:cstheme="majorBidi" w:eastAsiaTheme="majorEastAsia" w:hAnsiTheme="majorHAnsi"/>
       <w:i/>
       <w:iCs/>
       <w:color w:themeColor="accent1" w:val="4F81BD"/>
@@ -3779,7 +3856,7 @@
     <w:qFormat/>
     <w:rsid w:val="00fc693f"/>
     <w:rPr>
-      <w:rFonts w:ascii="Calibri" w:hAnsi="Calibri" w:eastAsia="ＭＳ ゴシック" w:cs="" w:asciiTheme="majorHAnsi" w:cstheme="majorBidi" w:eastAsiaTheme="majorEastAsia" w:hAnsiTheme="majorHAnsi"/>
+      <w:rFonts w:ascii="Calibri" w:hAnsi="Calibri" w:eastAsia="" w:cs="" w:asciiTheme="majorHAnsi" w:cstheme="majorBidi" w:eastAsiaTheme="majorEastAsia" w:hAnsiTheme="majorHAnsi"/>
       <w:b/>
       <w:bCs/>
       <w:i/>
@@ -3796,7 +3873,7 @@
     <w:qFormat/>
     <w:rsid w:val="00fc693f"/>
     <w:rPr>
-      <w:rFonts w:ascii="Calibri" w:hAnsi="Calibri" w:eastAsia="ＭＳ ゴシック" w:cs="" w:asciiTheme="majorHAnsi" w:cstheme="majorBidi" w:eastAsiaTheme="majorEastAsia" w:hAnsiTheme="majorHAnsi"/>
+      <w:rFonts w:ascii="Calibri" w:hAnsi="Calibri" w:eastAsia="" w:cs="" w:asciiTheme="majorHAnsi" w:cstheme="majorBidi" w:eastAsiaTheme="majorEastAsia" w:hAnsiTheme="majorHAnsi"/>
       <w:color w:themeColor="accent1" w:themeShade="7f" w:val="243F60"/>
     </w:rPr>
   </w:style>
@@ -3809,7 +3886,7 @@
     <w:qFormat/>
     <w:rsid w:val="00fc693f"/>
     <w:rPr>
-      <w:rFonts w:ascii="Calibri" w:hAnsi="Calibri" w:eastAsia="ＭＳ ゴシック" w:cs="" w:asciiTheme="majorHAnsi" w:cstheme="majorBidi" w:eastAsiaTheme="majorEastAsia" w:hAnsiTheme="majorHAnsi"/>
+      <w:rFonts w:ascii="Calibri" w:hAnsi="Calibri" w:eastAsia="" w:cs="" w:asciiTheme="majorHAnsi" w:cstheme="majorBidi" w:eastAsiaTheme="majorEastAsia" w:hAnsiTheme="majorHAnsi"/>
       <w:i/>
       <w:iCs/>
       <w:color w:themeColor="accent1" w:themeShade="7f" w:val="243F60"/>
@@ -3824,7 +3901,7 @@
     <w:qFormat/>
     <w:rsid w:val="00fc693f"/>
     <w:rPr>
-      <w:rFonts w:ascii="Calibri" w:hAnsi="Calibri" w:eastAsia="ＭＳ ゴシック" w:cs="" w:asciiTheme="majorHAnsi" w:cstheme="majorBidi" w:eastAsiaTheme="majorEastAsia" w:hAnsiTheme="majorHAnsi"/>
+      <w:rFonts w:ascii="Calibri" w:hAnsi="Calibri" w:eastAsia="" w:cs="" w:asciiTheme="majorHAnsi" w:cstheme="majorBidi" w:eastAsiaTheme="majorEastAsia" w:hAnsiTheme="majorHAnsi"/>
       <w:i/>
       <w:iCs/>
       <w:color w:themeColor="text1" w:themeTint="bf" w:val="404040"/>
@@ -3839,7 +3916,7 @@
     <w:qFormat/>
     <w:rsid w:val="00fc693f"/>
     <w:rPr>
-      <w:rFonts w:ascii="Calibri" w:hAnsi="Calibri" w:eastAsia="ＭＳ ゴシック" w:cs="" w:asciiTheme="majorHAnsi" w:cstheme="majorBidi" w:eastAsiaTheme="majorEastAsia" w:hAnsiTheme="majorHAnsi"/>
+      <w:rFonts w:ascii="Calibri" w:hAnsi="Calibri" w:eastAsia="" w:cs="" w:asciiTheme="majorHAnsi" w:cstheme="majorBidi" w:eastAsiaTheme="majorEastAsia" w:hAnsiTheme="majorHAnsi"/>
       <w:color w:themeColor="accent1" w:val="4F81BD"/>
       <w:sz w:val="20"/>
       <w:szCs w:val="20"/>
@@ -3854,7 +3931,7 @@
     <w:qFormat/>
     <w:rsid w:val="00fc693f"/>
     <w:rPr>
-      <w:rFonts w:ascii="Calibri" w:hAnsi="Calibri" w:eastAsia="ＭＳ ゴシック" w:cs="" w:asciiTheme="majorHAnsi" w:cstheme="majorBidi" w:eastAsiaTheme="majorEastAsia" w:hAnsiTheme="majorHAnsi"/>
+      <w:rFonts w:ascii="Calibri" w:hAnsi="Calibri" w:eastAsia="" w:cs="" w:asciiTheme="majorHAnsi" w:cstheme="majorBidi" w:eastAsiaTheme="majorEastAsia" w:hAnsiTheme="majorHAnsi"/>
       <w:i/>
       <w:iCs/>
       <w:color w:themeColor="text1" w:themeTint="bf" w:val="404040"/>
@@ -4084,12 +4161,13 @@
     <w:rsid w:val="00fc693f"/>
     <w:pPr>
       <w:widowControl/>
+      <w:suppressAutoHyphens w:val="true"/>
       <w:bidi w:val="0"/>
       <w:spacing w:lineRule="auto" w:line="240" w:before="0" w:after="0"/>
       <w:jc w:val="start"/>
     </w:pPr>
     <w:rPr>
-      <w:rFonts w:ascii="Cambria" w:hAnsi="Cambria" w:eastAsia="ＭＳ 明朝" w:cs="" w:asciiTheme="minorHAnsi" w:cstheme="minorBidi" w:eastAsiaTheme="minorEastAsia" w:hAnsiTheme="minorHAnsi"/>
+      <w:rFonts w:ascii="Cambria" w:hAnsi="Cambria" w:eastAsia="" w:cs="" w:asciiTheme="minorHAnsi" w:cstheme="minorBidi" w:eastAsiaTheme="minorEastAsia" w:hAnsiTheme="minorHAnsi"/>
       <w:color w:val="auto"/>
       <w:kern w:val="0"/>
       <w:sz w:val="22"/>
@@ -4113,7 +4191,7 @@
       <w:contextualSpacing/>
     </w:pPr>
     <w:rPr>
-      <w:rFonts w:ascii="Calibri" w:hAnsi="Calibri" w:eastAsia="ＭＳ ゴシック" w:cs="" w:asciiTheme="majorHAnsi" w:cstheme="majorBidi" w:eastAsiaTheme="majorEastAsia" w:hAnsiTheme="majorHAnsi"/>
+      <w:rFonts w:ascii="Calibri" w:hAnsi="Calibri" w:eastAsia="" w:cs="" w:asciiTheme="majorHAnsi" w:cstheme="majorBidi" w:eastAsiaTheme="majorEastAsia" w:hAnsiTheme="majorHAnsi"/>
       <w:b/>
       <w:color w:val="17365D"/>
       <w:spacing w:val="5"/>
@@ -4132,7 +4210,7 @@
     <w:rsid w:val="00fc693f"/>
     <w:pPr/>
     <w:rPr>
-      <w:rFonts w:ascii="Calibri" w:hAnsi="Calibri" w:eastAsia="ＭＳ ゴシック" w:cs="" w:asciiTheme="majorHAnsi" w:cstheme="majorBidi" w:eastAsiaTheme="majorEastAsia" w:hAnsiTheme="majorHAnsi"/>
+      <w:rFonts w:ascii="Calibri" w:hAnsi="Calibri" w:eastAsia="" w:cs="" w:asciiTheme="majorHAnsi" w:cstheme="majorBidi" w:eastAsiaTheme="majorEastAsia" w:hAnsiTheme="majorHAnsi"/>
       <w:i/>
       <w:iCs/>
       <w:color w:themeColor="accent1" w:val="4F81BD"/>
@@ -4365,12 +4443,13 @@
         <w:tab w:val="left" w:pos="3456" w:leader="none"/>
         <w:tab w:val="left" w:pos="4032" w:leader="none"/>
       </w:tabs>
+      <w:suppressAutoHyphens w:val="true"/>
       <w:bidi w:val="0"/>
       <w:spacing w:lineRule="auto" w:line="276" w:before="0" w:after="200"/>
       <w:jc w:val="start"/>
     </w:pPr>
     <w:rPr>
-      <w:rFonts w:ascii="Courier" w:hAnsi="Courier" w:eastAsia="ＭＳ 明朝" w:cs="" w:cstheme="minorBidi" w:eastAsiaTheme="minorEastAsia"/>
+      <w:rFonts w:ascii="Courier" w:hAnsi="Courier" w:eastAsia="" w:cs="" w:cstheme="minorBidi" w:eastAsiaTheme="minorEastAsia"/>
       <w:color w:val="auto"/>
       <w:kern w:val="0"/>
       <w:sz w:val="20"/>
@@ -4441,6 +4520,7 @@
     <w:qFormat/>
     <w:pPr>
       <w:widowControl/>
+      <w:suppressAutoHyphens w:val="true"/>
       <w:bidi w:val="0"/>
       <w:spacing w:lineRule="auto" w:line="276" w:before="60" w:after="100"/>
       <w:ind w:start="259"/>
@@ -7587,7 +7667,6 @@
       <w:pPr>
         <w:spacing w:before="0" w:after="0" w:line="240" w:lineRule="auto"/>
       </w:pPr>
-      <w:rPr/>
       <w:tblPr/>
       <w:tcPr>
         <w:tcBorders>
@@ -7733,7 +7812,6 @@
       <w:pPr>
         <w:spacing w:before="0" w:after="0" w:line="240" w:lineRule="auto"/>
       </w:pPr>
-      <w:rPr/>
       <w:tblPr/>
       <w:tcPr>
         <w:tcBorders>
@@ -7879,7 +7957,6 @@
       <w:pPr>
         <w:spacing w:before="0" w:after="0" w:line="240" w:lineRule="auto"/>
       </w:pPr>
-      <w:rPr/>
       <w:tblPr/>
       <w:tcPr>
         <w:tcBorders>
@@ -8025,7 +8102,6 @@
       <w:pPr>
         <w:spacing w:before="0" w:after="0" w:line="240" w:lineRule="auto"/>
       </w:pPr>
-      <w:rPr/>
       <w:tblPr/>
       <w:tcPr>
         <w:tcBorders>
@@ -8171,7 +8247,6 @@
       <w:pPr>
         <w:spacing w:before="0" w:after="0" w:line="240" w:lineRule="auto"/>
       </w:pPr>
-      <w:rPr/>
       <w:tblPr/>
       <w:tcPr>
         <w:tcBorders>
@@ -8317,7 +8392,6 @@
       <w:pPr>
         <w:spacing w:before="0" w:after="0" w:line="240" w:lineRule="auto"/>
       </w:pPr>
-      <w:rPr/>
       <w:tblPr/>
       <w:tcPr>
         <w:tcBorders>
@@ -8463,7 +8537,6 @@
       <w:pPr>
         <w:spacing w:before="0" w:after="0" w:line="240" w:lineRule="auto"/>
       </w:pPr>
-      <w:rPr/>
       <w:tblPr/>
       <w:tcPr>
         <w:tcBorders>

</xml_diff>